<commit_message>
CSV-Export und PNG-Download im Dashboard
- GET /api/export.csv: Verlaufspuffer als CSV, Spaltennamen wie das
  Pi-Log, damit tools/plot_messreihe.py die Datei direkt liest
- Verlaufspuffer auf 24 h erweitert (43200 Punkte, inkl. Temperaturen
  und Luftfeuchte); /api/history liefert nur noch die letzten 120
- "Diagramm speichern": SVG mit uebernommenen Stylesheet-Stilen in
  ein PNG gerastert (doppelte Aufloesung)
- Dokumentation aktualisiert (README, docx, pdf)

Co-Authored-By: Claude Fable 5 <noreply@anthropic.com>
</commit_message>
<xml_diff>
--- a/Dokumentation.docx
+++ b/Dokumentation.docx
@@ -19,7 +19,7 @@
           <w:color w:val="52514E"/>
           <w:sz w:val="19"/>
         </w:rPr>
-        <w:t>Stand: 05.08.2026</w:t>
+        <w:t>Stand: 06.08.2026</w:t>
       </w:r>
     </w:p>
     <w:p>
@@ -712,7 +712,78 @@
                 <w:b w:val="0"/>
                 <w:sz w:val="19"/>
               </w:rPr>
-              <w:t>pH-Verlauf für das Diagramm</w:t>
+              <w:t>pH-Verlauf für das Diagramm (</w:t>
+            </w:r>
+            <w:r>
+              <w:rPr>
+                <w:rFonts w:ascii="Consolas" w:hAnsi="Consolas"/>
+                <w:b w:val="0"/>
+                <w:color w:val="0B0B0B"/>
+                <w:sz w:val="19"/>
+              </w:rPr>
+              <w:t>?limit=…</w:t>
+            </w:r>
+            <w:r>
+              <w:rPr>
+                <w:b w:val="0"/>
+                <w:sz w:val="19"/>
+              </w:rPr>
+              <w:t>, Standard 120)</w:t>
+            </w:r>
+          </w:p>
+        </w:tc>
+      </w:tr>
+      <w:tr>
+        <w:tc>
+          <w:tcPr>
+            <w:tcW w:type="dxa" w:w="3024"/>
+          </w:tcPr>
+          <w:p>
+            <w:pPr>
+              <w:spacing w:after="40"/>
+            </w:pPr>
+            <w:r>
+              <w:rPr>
+                <w:b w:val="0"/>
+                <w:sz w:val="19"/>
+              </w:rPr>
+              <w:t>GET</w:t>
+            </w:r>
+          </w:p>
+        </w:tc>
+        <w:tc>
+          <w:tcPr>
+            <w:tcW w:type="dxa" w:w="3024"/>
+          </w:tcPr>
+          <w:p>
+            <w:pPr>
+              <w:spacing w:after="40"/>
+            </w:pPr>
+            <w:r>
+              <w:rPr>
+                <w:rFonts w:ascii="Consolas" w:hAnsi="Consolas"/>
+                <w:b w:val="0"/>
+                <w:color w:val="0B0B0B"/>
+                <w:sz w:val="19"/>
+              </w:rPr>
+              <w:t>/api/export.csv</w:t>
+            </w:r>
+          </w:p>
+        </w:tc>
+        <w:tc>
+          <w:tcPr>
+            <w:tcW w:type="dxa" w:w="3024"/>
+          </w:tcPr>
+          <w:p>
+            <w:pPr>
+              <w:spacing w:after="40"/>
+            </w:pPr>
+            <w:r>
+              <w:rPr>
+                <w:b w:val="0"/>
+                <w:sz w:val="19"/>
+              </w:rPr>
+              <w:t>gesamten Verlaufspuffer als CSV herunterladen</w:t>
             </w:r>
           </w:p>
         </w:tc>
@@ -1349,7 +1420,7 @@
                 <w:color w:val="0B0B0B"/>
                 <w:sz w:val="19"/>
               </w:rPr>
-              <w:t>120</w:t>
+              <w:t>43200</w:t>
             </w:r>
           </w:p>
         </w:tc>
@@ -1366,7 +1437,7 @@
                 <w:b w:val="0"/>
                 <w:sz w:val="19"/>
               </w:rPr>
-              <w:t>Punkte im Verlaufsdiagramm</w:t>
+              <w:t>Größe des Verlaufspuffers (≈ 24 h bei 2-s-Takt); Diagramm zeigt die letzten 120</w:t>
             </w:r>
           </w:p>
         </w:tc>
@@ -1504,7 +1575,7 @@
                 <w:b w:val="0"/>
                 <w:sz w:val="19"/>
               </w:rPr>
-              <w:t>Live-Liniendiagramm mit Zielband, Tooltip, Tastaturbedienung (Pfeiltasten) und Tabellenansicht</w:t>
+              <w:t>Live-Liniendiagramm mit Zielband, Tooltip, Tastaturbedienung (Pfeiltasten) und Tabellenansicht; „CSV exportieren“ lädt die Messwerte herunter, „Diagramm speichern“ das Bild als PNG</w:t>
             </w:r>
           </w:p>
         </w:tc>
@@ -3119,7 +3190,37 @@
         <w:rPr>
           <w:b w:val="0"/>
         </w:rPr>
-        <w:t xml:space="preserve"> erzeugt aus der CSV-Logdatei druckfertige Diagramme (PNG, 300 dpi).</w:t>
+        <w:t xml:space="preserve"> erzeugt aus der CSV-Logdatei druckfertige Diagramme (PNG, 300 dpi). Es liest sowohl das vollständige Log vom Pi (</w:t>
+      </w:r>
+      <w:r>
+        <w:rPr>
+          <w:rFonts w:ascii="Consolas" w:hAnsi="Consolas"/>
+          <w:b w:val="0"/>
+          <w:color w:val="0B0B0B"/>
+          <w:sz w:val="19"/>
+        </w:rPr>
+        <w:t>hydroponik_log.csv</w:t>
+      </w:r>
+      <w:r>
+        <w:rPr>
+          <w:b w:val="0"/>
+        </w:rPr>
+        <w:t xml:space="preserve">, per </w:t>
+      </w:r>
+      <w:r>
+        <w:rPr>
+          <w:rFonts w:ascii="Consolas" w:hAnsi="Consolas"/>
+          <w:b w:val="0"/>
+          <w:color w:val="0B0B0B"/>
+          <w:sz w:val="19"/>
+        </w:rPr>
+        <w:t>scp</w:t>
+      </w:r>
+      <w:r>
+        <w:rPr>
+          <w:b w:val="0"/>
+        </w:rPr>
+        <w:t xml:space="preserve"> holen) als auch die über „CSV exportieren“ aus der Weboberfläche heruntergeladene Datei – beide verwenden dieselben Spaltennamen.</w:t>
       </w:r>
     </w:p>
     <w:p>

</xml_diff>

<commit_message>
Doku: Verlaufspuffer korrekt beschrieben, Stand 16.09.2026
Co-Authored-By: Claude Fable 5.1 <noreply@anthropic.com>
</commit_message>
<xml_diff>
--- a/Dokumentation.docx
+++ b/Dokumentation.docx
@@ -19,7 +19,7 @@
           <w:color w:val="52514E"/>
           <w:sz w:val="19"/>
         </w:rPr>
-        <w:t>Stand: 06.08.2026</w:t>
+        <w:t>Stand: 16.09.2026</w:t>
       </w:r>
     </w:p>
     <w:p>
@@ -517,7 +517,23 @@
                 <w:b w:val="0"/>
                 <w:sz w:val="19"/>
               </w:rPr>
-              <w:t>Hält die letzten 120 pH-Werte, damit das Diagramm nach einem Seiten-Reload nicht leer beginnt</w:t>
+              <w:t>Hält die Messwerte der letzten rund 24 Stunden (</w:t>
+            </w:r>
+            <w:r>
+              <w:rPr>
+                <w:rFonts w:ascii="Consolas" w:hAnsi="Consolas"/>
+                <w:b w:val="0"/>
+                <w:color w:val="0B0B0B"/>
+                <w:sz w:val="19"/>
+              </w:rPr>
+              <w:t>HISTORY_LIMIT</w:t>
+            </w:r>
+            <w:r>
+              <w:rPr>
+                <w:b w:val="0"/>
+                <w:sz w:val="19"/>
+              </w:rPr>
+              <w:t>, Standard 43200 Einträge bei 2-s-Takt) für CSV-Export und Diagramm; das Diagramm zeigt nach einem Seiten-Reload die letzten 120 Punkte</w:t>
             </w:r>
           </w:p>
         </w:tc>

</xml_diff>

<commit_message>
Pi-Programm ins Repo: laufende Fassung, Kalibrierskript, Archiv, CSV-Fixes
- iot/hydroponik.py: Fassung, die seit 17.09.2026 auf dem Pi laeuft
  (ueberarbeiteter Vorprojekt-Code), mit Korrekturen aus dem Abgleich
  mit server.js/app.js: Sensorspannung in Volt, letzte_dosierung als
  Zeitstempel, Not-Aus ohne Lock, --nur-messen, Dateien neben dem Skript,
  Kopfzeilenpruefung fuer alte Logs, Bind-Retry der API
- iot/kalibrieren.py: Zweipunktkalibrierung, schreibt kalibrierung.json
- iot/archiv/: ganzerCode.py (Messreihen bis 11.08.) und der nie
  betriebene Entwurf vom 06.08. mit README zur Einordnung
- server/csv-utils.js: Zeitstempel, Wahrheitswerte und Nullwerte im
  CSV-Export erhalten; Tests erweitert, npm test
- README/Dokumentation: Pi-Programm, Kalibrierung, Uhrzeitpruefung,
  Excel-Warnung, Fehlersuche; DOCX/PDF neu erzeugt

Co-Authored-By: Claude Fable 5.1 <noreply@anthropic.com>
</commit_message>
<xml_diff>
--- a/Dokumentation.docx
+++ b/Dokumentation.docx
@@ -19,7 +19,7 @@
           <w:color w:val="52514E"/>
           <w:sz w:val="19"/>
         </w:rPr>
-        <w:t>Stand: 16.09.2026</w:t>
+        <w:t>Stand: 18.09.2026</w:t>
       </w:r>
     </w:p>
     <w:p>
@@ -212,6 +212,379 @@
           <w:sz w:val="18"/>
         </w:rPr>
         <w:t xml:space="preserve">                            Verlaufspuffer</w:t>
+      </w:r>
+    </w:p>
+    <w:p>
+      <w:pPr>
+        <w:pStyle w:val="Heading3"/>
+      </w:pPr>
+      <w:r>
+        <w:rPr>
+          <w:b w:val="0"/>
+        </w:rPr>
+        <w:t>iot/ – das Programm auf dem Pi</w:t>
+      </w:r>
+    </w:p>
+    <w:tbl>
+      <w:tblPr>
+        <w:tblStyle w:val="TableGrid"/>
+        <w:tblW w:type="auto" w:w="0"/>
+        <w:jc w:val="left"/>
+        <w:tblLook w:firstColumn="1" w:firstRow="1" w:lastColumn="0" w:lastRow="0" w:noHBand="0" w:noVBand="1" w:val="04A0"/>
+      </w:tblPr>
+      <w:tblGrid>
+        <w:gridCol w:w="4536"/>
+        <w:gridCol w:w="4536"/>
+      </w:tblGrid>
+      <w:tr>
+        <w:tc>
+          <w:tcPr>
+            <w:tcW w:type="dxa" w:w="4536"/>
+            <w:shd w:val="clear" w:fill="EAF1FB"/>
+          </w:tcPr>
+          <w:p>
+            <w:pPr>
+              <w:spacing w:after="40"/>
+            </w:pPr>
+            <w:r>
+              <w:rPr>
+                <w:b/>
+                <w:sz w:val="19"/>
+              </w:rPr>
+              <w:t>Datei</w:t>
+            </w:r>
+          </w:p>
+        </w:tc>
+        <w:tc>
+          <w:tcPr>
+            <w:tcW w:type="dxa" w:w="4536"/>
+            <w:shd w:val="clear" w:fill="EAF1FB"/>
+          </w:tcPr>
+          <w:p>
+            <w:pPr>
+              <w:spacing w:after="40"/>
+            </w:pPr>
+            <w:r>
+              <w:rPr>
+                <w:b/>
+                <w:sz w:val="19"/>
+              </w:rPr>
+              <w:t>Aufgabe</w:t>
+            </w:r>
+          </w:p>
+        </w:tc>
+      </w:tr>
+      <w:tr>
+        <w:tc>
+          <w:tcPr>
+            <w:tcW w:type="dxa" w:w="4536"/>
+          </w:tcPr>
+          <w:p>
+            <w:pPr>
+              <w:spacing w:after="40"/>
+            </w:pPr>
+            <w:r>
+              <w:rPr>
+                <w:rFonts w:ascii="Consolas" w:hAnsi="Consolas"/>
+                <w:b w:val="0"/>
+                <w:color w:val="0B0B0B"/>
+                <w:sz w:val="19"/>
+              </w:rPr>
+              <w:t>hydroponik.py</w:t>
+            </w:r>
+          </w:p>
+        </w:tc>
+        <w:tc>
+          <w:tcPr>
+            <w:tcW w:type="dxa" w:w="4536"/>
+          </w:tcPr>
+          <w:p>
+            <w:pPr>
+              <w:spacing w:after="40"/>
+            </w:pPr>
+            <w:r>
+              <w:rPr>
+                <w:b w:val="0"/>
+                <w:sz w:val="19"/>
+              </w:rPr>
+              <w:t>Messprogramm mit pH-Regelung und Web-API (Port 5000). Läuft seit dem 17.09.2026 auf dem Pi; überarbeitete Fassung des Vorprojekt-Codes. Meldet alle Messwerte, Sensorspannung in Volt, Betriebsart, Dosierzähler und Sperrzeit</w:t>
+            </w:r>
+          </w:p>
+        </w:tc>
+      </w:tr>
+      <w:tr>
+        <w:tc>
+          <w:tcPr>
+            <w:tcW w:type="dxa" w:w="4536"/>
+          </w:tcPr>
+          <w:p>
+            <w:pPr>
+              <w:spacing w:after="40"/>
+            </w:pPr>
+            <w:r>
+              <w:rPr>
+                <w:rFonts w:ascii="Consolas" w:hAnsi="Consolas"/>
+                <w:b w:val="0"/>
+                <w:color w:val="0B0B0B"/>
+                <w:sz w:val="19"/>
+              </w:rPr>
+              <w:t>kalibrieren.py</w:t>
+            </w:r>
+          </w:p>
+        </w:tc>
+        <w:tc>
+          <w:tcPr>
+            <w:tcW w:type="dxa" w:w="4536"/>
+          </w:tcPr>
+          <w:p>
+            <w:pPr>
+              <w:spacing w:after="40"/>
+            </w:pPr>
+            <w:r>
+              <w:rPr>
+                <w:b w:val="0"/>
+                <w:sz w:val="19"/>
+              </w:rPr>
+              <w:t xml:space="preserve">Zweipunktkalibrierung (pH 4,01 / 7,00) mit Verifikation bei pH 10,01. Schreibt </w:t>
+            </w:r>
+            <w:r>
+              <w:rPr>
+                <w:rFonts w:ascii="Consolas" w:hAnsi="Consolas"/>
+                <w:b w:val="0"/>
+                <w:color w:val="0B0B0B"/>
+                <w:sz w:val="19"/>
+              </w:rPr>
+              <w:t>iot/kalibrierung.json</w:t>
+            </w:r>
+            <w:r>
+              <w:rPr>
+                <w:b w:val="0"/>
+                <w:sz w:val="19"/>
+              </w:rPr>
+              <w:t xml:space="preserve">, die </w:t>
+            </w:r>
+            <w:r>
+              <w:rPr>
+                <w:rFonts w:ascii="Consolas" w:hAnsi="Consolas"/>
+                <w:b w:val="0"/>
+                <w:color w:val="0B0B0B"/>
+                <w:sz w:val="19"/>
+              </w:rPr>
+              <w:t>hydroponik.py</w:t>
+            </w:r>
+            <w:r>
+              <w:rPr>
+                <w:b w:val="0"/>
+                <w:sz w:val="19"/>
+              </w:rPr>
+              <w:t xml:space="preserve"> beim Start einliest. </w:t>
+            </w:r>
+            <w:r>
+              <w:rPr>
+                <w:b/>
+                <w:sz w:val="19"/>
+              </w:rPr>
+              <w:t>Ohne diese Datei startet das Messprogramm nicht.</w:t>
+            </w:r>
+          </w:p>
+        </w:tc>
+      </w:tr>
+      <w:tr>
+        <w:tc>
+          <w:tcPr>
+            <w:tcW w:type="dxa" w:w="4536"/>
+          </w:tcPr>
+          <w:p>
+            <w:pPr>
+              <w:spacing w:after="40"/>
+            </w:pPr>
+            <w:r>
+              <w:rPr>
+                <w:rFonts w:ascii="Consolas" w:hAnsi="Consolas"/>
+                <w:b w:val="0"/>
+                <w:color w:val="0B0B0B"/>
+                <w:sz w:val="19"/>
+              </w:rPr>
+              <w:t>hydroponik.service</w:t>
+            </w:r>
+          </w:p>
+        </w:tc>
+        <w:tc>
+          <w:tcPr>
+            <w:tcW w:type="dxa" w:w="4536"/>
+          </w:tcPr>
+          <w:p>
+            <w:pPr>
+              <w:spacing w:after="40"/>
+            </w:pPr>
+            <w:r>
+              <w:rPr>
+                <w:b w:val="0"/>
+                <w:sz w:val="19"/>
+              </w:rPr>
+              <w:t xml:space="preserve">systemd-Dienst für den automatischen Start, bewusst mit </w:t>
+            </w:r>
+            <w:r>
+              <w:rPr>
+                <w:rFonts w:ascii="Consolas" w:hAnsi="Consolas"/>
+                <w:b w:val="0"/>
+                <w:color w:val="0B0B0B"/>
+                <w:sz w:val="19"/>
+              </w:rPr>
+              <w:t>--nur-messen</w:t>
+            </w:r>
+          </w:p>
+        </w:tc>
+      </w:tr>
+      <w:tr>
+        <w:tc>
+          <w:tcPr>
+            <w:tcW w:type="dxa" w:w="4536"/>
+          </w:tcPr>
+          <w:p>
+            <w:pPr>
+              <w:spacing w:after="40"/>
+            </w:pPr>
+            <w:r>
+              <w:rPr>
+                <w:rFonts w:ascii="Consolas" w:hAnsi="Consolas"/>
+                <w:b w:val="0"/>
+                <w:color w:val="0B0B0B"/>
+                <w:sz w:val="19"/>
+              </w:rPr>
+              <w:t>simulator.js</w:t>
+            </w:r>
+          </w:p>
+        </w:tc>
+        <w:tc>
+          <w:tcPr>
+            <w:tcW w:type="dxa" w:w="4536"/>
+          </w:tcPr>
+          <w:p>
+            <w:pPr>
+              <w:spacing w:after="40"/>
+            </w:pPr>
+            <w:r>
+              <w:rPr>
+                <w:b w:val="0"/>
+                <w:sz w:val="19"/>
+              </w:rPr>
+              <w:t>Ersatz für den Pi im Demobetrieb</w:t>
+            </w:r>
+          </w:p>
+        </w:tc>
+      </w:tr>
+      <w:tr>
+        <w:tc>
+          <w:tcPr>
+            <w:tcW w:type="dxa" w:w="4536"/>
+          </w:tcPr>
+          <w:p>
+            <w:pPr>
+              <w:spacing w:after="40"/>
+            </w:pPr>
+            <w:r>
+              <w:rPr>
+                <w:rFonts w:ascii="Consolas" w:hAnsi="Consolas"/>
+                <w:b w:val="0"/>
+                <w:color w:val="0B0B0B"/>
+                <w:sz w:val="19"/>
+              </w:rPr>
+              <w:t>archiv/</w:t>
+            </w:r>
+          </w:p>
+        </w:tc>
+        <w:tc>
+          <w:tcPr>
+            <w:tcW w:type="dxa" w:w="4536"/>
+          </w:tcPr>
+          <w:p>
+            <w:pPr>
+              <w:spacing w:after="40"/>
+            </w:pPr>
+            <w:r>
+              <w:rPr>
+                <w:b w:val="0"/>
+                <w:sz w:val="19"/>
+              </w:rPr>
+              <w:t xml:space="preserve">Frühere Programmstände, u. a. </w:t>
+            </w:r>
+            <w:r>
+              <w:rPr>
+                <w:rFonts w:ascii="Consolas" w:hAnsi="Consolas"/>
+                <w:b w:val="0"/>
+                <w:color w:val="0B0B0B"/>
+                <w:sz w:val="19"/>
+              </w:rPr>
+              <w:t>ganzerCode.py</w:t>
+            </w:r>
+            <w:r>
+              <w:rPr>
+                <w:b w:val="0"/>
+                <w:sz w:val="19"/>
+              </w:rPr>
+              <w:t xml:space="preserve">, mit dem alle Messreihen bis zum 11.08.2026 aufgenommen wurden (siehe </w:t>
+            </w:r>
+            <w:r>
+              <w:rPr>
+                <w:rFonts w:ascii="Consolas" w:hAnsi="Consolas"/>
+                <w:b w:val="0"/>
+                <w:sz w:val="19"/>
+              </w:rPr>
+              <w:t>iot/archiv/README.md</w:t>
+            </w:r>
+            <w:r>
+              <w:rPr>
+                <w:b w:val="0"/>
+                <w:sz w:val="19"/>
+              </w:rPr>
+              <w:t>)</w:t>
+            </w:r>
+          </w:p>
+        </w:tc>
+      </w:tr>
+    </w:tbl>
+    <w:p>
+      <w:pPr>
+        <w:spacing w:after="40"/>
+      </w:pPr>
+    </w:p>
+    <w:p>
+      <w:r>
+        <w:rPr>
+          <w:b w:val="0"/>
+        </w:rPr>
+        <w:t xml:space="preserve">Auf dem Pi entstehen zwei Protokolle neben dem Skript: </w:t>
+      </w:r>
+      <w:r>
+        <w:rPr>
+          <w:rFonts w:ascii="Consolas" w:hAnsi="Consolas"/>
+          <w:b w:val="0"/>
+          <w:color w:val="0B0B0B"/>
+          <w:sz w:val="19"/>
+        </w:rPr>
+        <w:t>hydroponik_log.csv</w:t>
+      </w:r>
+      <w:r>
+        <w:rPr>
+          <w:b w:val="0"/>
+        </w:rPr>
+        <w:t xml:space="preserve"> (jede Einzelmessung, alle 10 s) und </w:t>
+      </w:r>
+      <w:r>
+        <w:rPr>
+          <w:rFonts w:ascii="Consolas" w:hAnsi="Consolas"/>
+          <w:b w:val="0"/>
+          <w:color w:val="0B0B0B"/>
+          <w:sz w:val="19"/>
+        </w:rPr>
+        <w:t>dosierungen_log.csv</w:t>
+      </w:r>
+      <w:r>
+        <w:rPr>
+          <w:b w:val="0"/>
+        </w:rPr>
+        <w:t xml:space="preserve"> (Zeitpunkt, Dauer und Menge jeder Dosierung). Die Pumpe ist im Sensor-Log praktisch nie als aktiv zu sehen, weil der Zustand während eines Laufs nicht aktualisiert wird; Dosierungen sind über das Dosierprotokoll belegt.</w:t>
       </w:r>
     </w:p>
     <w:p>
@@ -2811,11 +3184,105 @@
       </w:r>
     </w:p>
     <w:p>
+      <w:pPr>
+        <w:pStyle w:val="Heading3"/>
+      </w:pPr>
       <w:r>
         <w:rPr>
           <w:b w:val="0"/>
         </w:rPr>
-        <w:t xml:space="preserve">Falls das Messskript bei dir anders heißt (z. B. </w:t>
+        <w:t>Vor jeder Messreihe: Uhrzeit prüfen</w:t>
+      </w:r>
+    </w:p>
+    <w:p>
+      <w:pPr>
+        <w:shd w:val="clear" w:fill="F2F1EE"/>
+        <w:spacing w:before="80" w:after="160"/>
+        <w:ind w:left="142"/>
+      </w:pPr>
+      <w:r>
+        <w:rPr>
+          <w:rFonts w:ascii="Consolas" w:hAnsi="Consolas"/>
+          <w:sz w:val="18"/>
+        </w:rPr>
+        <w:t>date</w:t>
+      </w:r>
+    </w:p>
+    <w:p>
+      <w:r>
+        <w:rPr>
+          <w:b w:val="0"/>
+        </w:rPr>
+        <w:t>Der Pi hat keine gepufferte Echtzeituhr. Ohne erreichbaren Zeitserver setzt er nach einem Neustart die zuletzt gespeicherte Uhrzeit fort – die Zeitstempel im Log tragen dann ein falsches Datum, nur die Zeitdifferenzen innerhalb einer Reihe stimmen. Das ist bei den Messreihen vom 07.08. und 11.08.2026 passiert (beide tragen Zeitstempel vom 06.08.). Stimmt die Zeit nicht, WLAN prüfen oder notfalls von Hand setzen:</w:t>
+      </w:r>
+    </w:p>
+    <w:p>
+      <w:pPr>
+        <w:shd w:val="clear" w:fill="F2F1EE"/>
+        <w:spacing w:before="80" w:after="160"/>
+        <w:ind w:left="142"/>
+      </w:pPr>
+      <w:r>
+        <w:rPr>
+          <w:rFonts w:ascii="Consolas" w:hAnsi="Consolas"/>
+          <w:sz w:val="18"/>
+        </w:rPr>
+        <w:t>sudo date -s "2026-09-18 14:30:00"</w:t>
+      </w:r>
+    </w:p>
+    <w:p>
+      <w:pPr>
+        <w:pStyle w:val="Heading3"/>
+      </w:pPr>
+      <w:r>
+        <w:rPr>
+          <w:b w:val="0"/>
+        </w:rPr>
+        <w:t>Kalibrieren (einmalig, und nach jedem Elektrodenwechsel oder Wässern)</w:t>
+      </w:r>
+    </w:p>
+    <w:p>
+      <w:pPr>
+        <w:shd w:val="clear" w:fill="F2F1EE"/>
+        <w:spacing w:before="80" w:after="160"/>
+        <w:ind w:left="142"/>
+      </w:pPr>
+      <w:r>
+        <w:rPr>
+          <w:rFonts w:ascii="Consolas" w:hAnsi="Consolas"/>
+          <w:sz w:val="18"/>
+        </w:rPr>
+        <w:t>cd ~/hydroponic-project</w:t>
+      </w:r>
+      <w:r>
+        <w:br/>
+      </w:r>
+      <w:r>
+        <w:rPr>
+          <w:rFonts w:ascii="Consolas" w:hAnsi="Consolas"/>
+          <w:sz w:val="18"/>
+        </w:rPr>
+        <w:t>python3 iot/kalibrieren.py</w:t>
+      </w:r>
+    </w:p>
+    <w:p>
+      <w:r>
+        <w:rPr>
+          <w:b w:val="0"/>
+        </w:rPr>
+        <w:t xml:space="preserve">Das Skript führt durch die Puffer pH 4,01, 7,00 und 10,01. Elektrode </w:t>
+      </w:r>
+      <w:r>
+        <w:rPr>
+          <w:b/>
+        </w:rPr>
+        <w:t>und</w:t>
+      </w:r>
+      <w:r>
+        <w:rPr>
+          <w:b w:val="0"/>
+        </w:rPr>
+        <w:t xml:space="preserve"> Temperatursensor in den jeweiligen Becher halten, warten, bis der angezeigte Wert stabil ist, dann mit Enter bestätigen. Ergebnis: </w:t>
       </w:r>
       <w:r>
         <w:rPr>
@@ -2824,13 +3291,13 @@
           <w:color w:val="0B0B0B"/>
           <w:sz w:val="19"/>
         </w:rPr>
-        <w:t>ganzerCode.py</w:t>
+        <w:t>iot/kalibrierung.json</w:t>
       </w:r>
       <w:r>
         <w:rPr>
           <w:b w:val="0"/>
         </w:rPr>
-        <w:t>), den Namen in den Befehlen entsprechend ersetzen.</w:t>
+        <w:t xml:space="preserve"> mit Steilheit, Nullpunkt und Kalibriertemperatur. Liegt die Steilheit unter 85 % des theoretischen Werts, warnt das Skript (Anforderung M-06).</w:t>
       </w:r>
     </w:p>
     <w:p>
@@ -2865,7 +3332,7 @@
           <w:rFonts w:ascii="Consolas" w:hAnsi="Consolas"/>
           <w:sz w:val="18"/>
         </w:rPr>
-        <w:t>python3 iot/hydroponik.py --nur-messen     # Messbetrieb, Pumpe gesperrt</w:t>
+        <w:t>python3 iot/hydroponik.py --nur-messen     # messen und loggen, keine automatische Dosierung</w:t>
       </w:r>
       <w:r>
         <w:br/>
@@ -2875,17 +3342,30 @@
           <w:rFonts w:ascii="Consolas" w:hAnsi="Consolas"/>
           <w:sz w:val="18"/>
         </w:rPr>
-        <w:t>python3 iot/hydroponik.py --regeln         # mit aktiver pH-Regelung</w:t>
+        <w:t>python3 iot/hydroponik.py                  # mit aktiver pH-Regelung</w:t>
       </w:r>
+    </w:p>
+    <w:p>
       <w:r>
-        <w:br/>
+        <w:rPr>
+          <w:b w:val="0"/>
+        </w:rPr>
+        <w:t xml:space="preserve">Im Messbetrieb bleibt der manuelle Testlauf über das Dashboard möglich. Die API bindet nur auf 192.168.10.1; zum Testen ohne Kabel </w:t>
       </w:r>
       <w:r>
         <w:rPr>
           <w:rFonts w:ascii="Consolas" w:hAnsi="Consolas"/>
-          <w:sz w:val="18"/>
+          <w:b w:val="0"/>
+          <w:color w:val="0B0B0B"/>
+          <w:sz w:val="19"/>
         </w:rPr>
-        <w:t>python3 iot/hydroponik.py --kalibrieren    # nur Sensorspannung anzeigen</w:t>
+        <w:t>HYDRO_API_HOST=0.0.0.0</w:t>
+      </w:r>
+      <w:r>
+        <w:rPr>
+          <w:b w:val="0"/>
+        </w:rPr>
+        <w:t xml:space="preserve"> voranstellen.</w:t>
       </w:r>
     </w:p>
     <w:p>
@@ -3118,7 +3598,7 @@
           <w:rFonts w:ascii="Consolas" w:hAnsi="Consolas"/>
           <w:sz w:val="18"/>
         </w:rPr>
-        <w:t># Pi → Windows (Messdaten holen)</w:t>
+        <w:t># Pi → Windows (Messdaten holen; die Logs liegen neben dem Skript in iot/)</w:t>
       </w:r>
       <w:r>
         <w:br/>
@@ -3128,7 +3608,37 @@
           <w:rFonts w:ascii="Consolas" w:hAnsi="Consolas"/>
           <w:sz w:val="18"/>
         </w:rPr>
-        <w:t>scp pi@192.168.10.1:~/hydroponic-project/hydroponik_log.csv C:\Users\prati\hydroponic-system\</w:t>
+        <w:t>scp pi@192.168.10.1:~/hydroponic-project/iot/hydroponik_log.csv C:\Users\prati\hydroponic-system\</w:t>
+      </w:r>
+      <w:r>
+        <w:br/>
+      </w:r>
+      <w:r>
+        <w:rPr>
+          <w:rFonts w:ascii="Consolas" w:hAnsi="Consolas"/>
+          <w:sz w:val="18"/>
+        </w:rPr>
+        <w:t>scp pi@192.168.10.1:~/hydroponic-project/iot/dosierungen_log.csv C:\Users\prati\hydroponic-system\</w:t>
+      </w:r>
+    </w:p>
+    <w:p>
+      <w:r>
+        <w:rPr>
+          <w:b w:val="0"/>
+        </w:rPr>
+        <w:t xml:space="preserve">Die CSV-Dateien </w:t>
+      </w:r>
+      <w:r>
+        <w:rPr>
+          <w:b/>
+        </w:rPr>
+        <w:t>nicht mit Excel öffnen und wieder speichern</w:t>
+      </w:r>
+      <w:r>
+        <w:rPr>
+          <w:b w:val="0"/>
+        </w:rPr>
+        <w:t>: Excel entfernt die Sekunden aus den Zeitstempeln und zerstört Dezimalzahlen (aus 5,45 wird „5.450.000.000.000.000“). Für die Auswertung immer die unveränderte Originaldatei verwenden.</w:t>
       </w:r>
     </w:p>
     <w:p>
@@ -4620,6 +5130,378 @@
                 <w:b w:val="0"/>
                 <w:sz w:val="19"/>
               </w:rPr>
+              <w:t>Pi: „Keine Kalibrierung gefunden“</w:t>
+            </w:r>
+          </w:p>
+        </w:tc>
+        <w:tc>
+          <w:tcPr>
+            <w:tcW w:type="dxa" w:w="3024"/>
+          </w:tcPr>
+          <w:p>
+            <w:pPr>
+              <w:spacing w:after="40"/>
+            </w:pPr>
+            <w:r>
+              <w:rPr>
+                <w:rFonts w:ascii="Consolas" w:hAnsi="Consolas"/>
+                <w:b w:val="0"/>
+                <w:color w:val="0B0B0B"/>
+                <w:sz w:val="19"/>
+              </w:rPr>
+              <w:t>iot/kalibrierung.json</w:t>
+            </w:r>
+            <w:r>
+              <w:rPr>
+                <w:b w:val="0"/>
+                <w:sz w:val="19"/>
+              </w:rPr>
+              <w:t xml:space="preserve"> fehlt</w:t>
+            </w:r>
+          </w:p>
+        </w:tc>
+        <w:tc>
+          <w:tcPr>
+            <w:tcW w:type="dxa" w:w="3024"/>
+          </w:tcPr>
+          <w:p>
+            <w:pPr>
+              <w:spacing w:after="40"/>
+            </w:pPr>
+            <w:r>
+              <w:rPr>
+                <w:rFonts w:ascii="Consolas" w:hAnsi="Consolas"/>
+                <w:b w:val="0"/>
+                <w:color w:val="0B0B0B"/>
+                <w:sz w:val="19"/>
+              </w:rPr>
+              <w:t>python3 iot/kalibrieren.py</w:t>
+            </w:r>
+            <w:r>
+              <w:rPr>
+                <w:b w:val="0"/>
+                <w:sz w:val="19"/>
+              </w:rPr>
+              <w:t xml:space="preserve"> ausführen (Abschnitt 4)</w:t>
+            </w:r>
+          </w:p>
+        </w:tc>
+      </w:tr>
+      <w:tr>
+        <w:tc>
+          <w:tcPr>
+            <w:tcW w:type="dxa" w:w="3024"/>
+          </w:tcPr>
+          <w:p>
+            <w:pPr>
+              <w:spacing w:after="40"/>
+            </w:pPr>
+            <w:r>
+              <w:rPr>
+                <w:b w:val="0"/>
+                <w:sz w:val="19"/>
+              </w:rPr>
+              <w:t>Pi: „API konnte nicht an 192.168.10.1:5000 binden“</w:t>
+            </w:r>
+          </w:p>
+        </w:tc>
+        <w:tc>
+          <w:tcPr>
+            <w:tcW w:type="dxa" w:w="3024"/>
+          </w:tcPr>
+          <w:p>
+            <w:pPr>
+              <w:spacing w:after="40"/>
+            </w:pPr>
+            <w:r>
+              <w:rPr>
+                <w:b w:val="0"/>
+                <w:sz w:val="19"/>
+              </w:rPr>
+              <w:t>Adresse beim Start noch nicht auf eth0</w:t>
+            </w:r>
+          </w:p>
+        </w:tc>
+        <w:tc>
+          <w:tcPr>
+            <w:tcW w:type="dxa" w:w="3024"/>
+          </w:tcPr>
+          <w:p>
+            <w:pPr>
+              <w:spacing w:after="40"/>
+            </w:pPr>
+            <w:r>
+              <w:rPr>
+                <w:b w:val="0"/>
+                <w:sz w:val="19"/>
+              </w:rPr>
+              <w:t xml:space="preserve">Programm versucht es alle 5 s erneut; feste Adresse per </w:t>
+            </w:r>
+            <w:r>
+              <w:rPr>
+                <w:rFonts w:ascii="Consolas" w:hAnsi="Consolas"/>
+                <w:b w:val="0"/>
+                <w:color w:val="0B0B0B"/>
+                <w:sz w:val="19"/>
+              </w:rPr>
+              <w:t>nmcli</w:t>
+            </w:r>
+            <w:r>
+              <w:rPr>
+                <w:b w:val="0"/>
+                <w:sz w:val="19"/>
+              </w:rPr>
+              <w:t xml:space="preserve"> prüfen (Abschnitt 3)</w:t>
+            </w:r>
+          </w:p>
+        </w:tc>
+      </w:tr>
+      <w:tr>
+        <w:tc>
+          <w:tcPr>
+            <w:tcW w:type="dxa" w:w="3024"/>
+          </w:tcPr>
+          <w:p>
+            <w:pPr>
+              <w:spacing w:after="40"/>
+            </w:pPr>
+            <w:r>
+              <w:rPr>
+                <w:b w:val="0"/>
+                <w:sz w:val="19"/>
+              </w:rPr>
+              <w:t xml:space="preserve">Dashboard zeigt Sensorspannung </w:t>
+            </w:r>
+            <w:r>
+              <w:rPr>
+                <w:rFonts w:ascii="Consolas" w:hAnsi="Consolas"/>
+                <w:b w:val="0"/>
+                <w:color w:val="0B0B0B"/>
+                <w:sz w:val="19"/>
+              </w:rPr>
+              <w:t>--</w:t>
+            </w:r>
+            <w:r>
+              <w:rPr>
+                <w:b w:val="0"/>
+                <w:sz w:val="19"/>
+              </w:rPr>
+              <w:t>, pH aber normal</w:t>
+            </w:r>
+          </w:p>
+        </w:tc>
+        <w:tc>
+          <w:tcPr>
+            <w:tcW w:type="dxa" w:w="3024"/>
+          </w:tcPr>
+          <w:p>
+            <w:pPr>
+              <w:spacing w:after="40"/>
+            </w:pPr>
+            <w:r>
+              <w:rPr>
+                <w:b w:val="0"/>
+                <w:sz w:val="19"/>
+              </w:rPr>
+              <w:t>Pi liefert die Spannung nicht oder in mV</w:t>
+            </w:r>
+          </w:p>
+        </w:tc>
+        <w:tc>
+          <w:tcPr>
+            <w:tcW w:type="dxa" w:w="3024"/>
+          </w:tcPr>
+          <w:p>
+            <w:pPr>
+              <w:spacing w:after="40"/>
+            </w:pPr>
+            <w:r>
+              <w:rPr>
+                <w:b w:val="0"/>
+                <w:sz w:val="19"/>
+              </w:rPr>
+              <w:t xml:space="preserve">Programmstand auf dem Pi prüfen: </w:t>
+            </w:r>
+            <w:r>
+              <w:rPr>
+                <w:rFonts w:ascii="Consolas" w:hAnsi="Consolas"/>
+                <w:b w:val="0"/>
+                <w:color w:val="0B0B0B"/>
+                <w:sz w:val="19"/>
+              </w:rPr>
+              <w:t>iot/hydroponik.py</w:t>
+            </w:r>
+            <w:r>
+              <w:rPr>
+                <w:b w:val="0"/>
+                <w:sz w:val="19"/>
+              </w:rPr>
+              <w:t xml:space="preserve"> meldet Volt</w:t>
+            </w:r>
+          </w:p>
+        </w:tc>
+      </w:tr>
+      <w:tr>
+        <w:tc>
+          <w:tcPr>
+            <w:tcW w:type="dxa" w:w="3024"/>
+          </w:tcPr>
+          <w:p>
+            <w:pPr>
+              <w:spacing w:after="40"/>
+            </w:pPr>
+            <w:r>
+              <w:rPr>
+                <w:b w:val="0"/>
+                <w:sz w:val="19"/>
+              </w:rPr>
+              <w:t>Zeitstempel im Log mit altem Datum</w:t>
+            </w:r>
+          </w:p>
+        </w:tc>
+        <w:tc>
+          <w:tcPr>
+            <w:tcW w:type="dxa" w:w="3024"/>
+          </w:tcPr>
+          <w:p>
+            <w:pPr>
+              <w:spacing w:after="40"/>
+            </w:pPr>
+            <w:r>
+              <w:rPr>
+                <w:b w:val="0"/>
+                <w:sz w:val="19"/>
+              </w:rPr>
+              <w:t>Pi ohne Zeitserver gestartet</w:t>
+            </w:r>
+          </w:p>
+        </w:tc>
+        <w:tc>
+          <w:tcPr>
+            <w:tcW w:type="dxa" w:w="3024"/>
+          </w:tcPr>
+          <w:p>
+            <w:pPr>
+              <w:spacing w:after="40"/>
+            </w:pPr>
+            <w:r>
+              <w:rPr>
+                <w:rFonts w:ascii="Consolas" w:hAnsi="Consolas"/>
+                <w:b w:val="0"/>
+                <w:color w:val="0B0B0B"/>
+                <w:sz w:val="19"/>
+              </w:rPr>
+              <w:t>date</w:t>
+            </w:r>
+            <w:r>
+              <w:rPr>
+                <w:b w:val="0"/>
+                <w:sz w:val="19"/>
+              </w:rPr>
+              <w:t xml:space="preserve"> prüfen, Zeit setzen (Abschnitt 4); Zeitdifferenzen bleiben gültig</w:t>
+            </w:r>
+          </w:p>
+        </w:tc>
+      </w:tr>
+      <w:tr>
+        <w:tc>
+          <w:tcPr>
+            <w:tcW w:type="dxa" w:w="3024"/>
+          </w:tcPr>
+          <w:p>
+            <w:pPr>
+              <w:spacing w:after="40"/>
+            </w:pPr>
+            <w:r>
+              <w:rPr>
+                <w:b w:val="0"/>
+                <w:sz w:val="19"/>
+              </w:rPr>
+              <w:t>Testlauf/Not-Aus im Dashboard ohne Wirkung</w:t>
+            </w:r>
+          </w:p>
+        </w:tc>
+        <w:tc>
+          <w:tcPr>
+            <w:tcW w:type="dxa" w:w="3024"/>
+          </w:tcPr>
+          <w:p>
+            <w:pPr>
+              <w:spacing w:after="40"/>
+            </w:pPr>
+            <w:r>
+              <w:rPr>
+                <w:b w:val="0"/>
+                <w:sz w:val="19"/>
+              </w:rPr>
+              <w:t xml:space="preserve">auf dem Pi läuft </w:t>
+            </w:r>
+            <w:r>
+              <w:rPr>
+                <w:rFonts w:ascii="Consolas" w:hAnsi="Consolas"/>
+                <w:b w:val="0"/>
+                <w:color w:val="0B0B0B"/>
+                <w:sz w:val="19"/>
+              </w:rPr>
+              <w:t>ganzerCode.py</w:t>
+            </w:r>
+            <w:r>
+              <w:rPr>
+                <w:b w:val="0"/>
+                <w:sz w:val="19"/>
+              </w:rPr>
+              <w:t xml:space="preserve"> (alte Endpunkte)</w:t>
+            </w:r>
+          </w:p>
+        </w:tc>
+        <w:tc>
+          <w:tcPr>
+            <w:tcW w:type="dxa" w:w="3024"/>
+          </w:tcPr>
+          <w:p>
+            <w:pPr>
+              <w:spacing w:after="40"/>
+            </w:pPr>
+            <w:r>
+              <w:rPr>
+                <w:b w:val="0"/>
+                <w:sz w:val="19"/>
+              </w:rPr>
+              <w:t xml:space="preserve">aktuelles </w:t>
+            </w:r>
+            <w:r>
+              <w:rPr>
+                <w:rFonts w:ascii="Consolas" w:hAnsi="Consolas"/>
+                <w:b w:val="0"/>
+                <w:color w:val="0B0B0B"/>
+                <w:sz w:val="19"/>
+              </w:rPr>
+              <w:t>iot/hydroponik.py</w:t>
+            </w:r>
+            <w:r>
+              <w:rPr>
+                <w:b w:val="0"/>
+                <w:sz w:val="19"/>
+              </w:rPr>
+              <w:t xml:space="preserve"> auf den Pi kopieren</w:t>
+            </w:r>
+          </w:p>
+        </w:tc>
+      </w:tr>
+      <w:tr>
+        <w:tc>
+          <w:tcPr>
+            <w:tcW w:type="dxa" w:w="3024"/>
+          </w:tcPr>
+          <w:p>
+            <w:pPr>
+              <w:spacing w:after="40"/>
+            </w:pPr>
+            <w:r>
+              <w:rPr>
+                <w:b w:val="0"/>
+                <w:sz w:val="19"/>
+              </w:rPr>
               <w:t xml:space="preserve">Skriptausführung von </w:t>
             </w:r>
             <w:r>

</xml_diff>